<commit_message>
Add validation and shared types for scripts
Introduce class-validator for DTO validation and refactor scripts service to use shared types. Creates @script-hub/types package with CreateScriptDto and other types, defines CreateScriptDto in backend with validation decorators, and updates controller/service to use proper types and method signatures. Fixes Script type to extend CreateScriptDto to avoid duplication.
</commit_message>
<xml_diff>
--- a/Specifications/TDD.docx
+++ b/Specifications/TDD.docx
@@ -37,6 +37,27 @@
           <w:bCs/>
         </w:rPr>
         <w:t xml:space="preserve"> Document</w:t>
+      </w:r>
+      <w:r>
+        <w:rPr>
+          <w:b/>
+          <w:bCs/>
+        </w:rPr>
+        <w:t xml:space="preserve"> (</w:t>
+      </w:r>
+      <w:r>
+        <w:rPr>
+          <w:b/>
+          <w:bCs/>
+        </w:rPr>
+        <w:t>V</w:t>
+      </w:r>
+      <w:r>
+        <w:rPr>
+          <w:b/>
+          <w:bCs/>
+        </w:rPr>
+        <w:t>1)</w:t>
       </w:r>
     </w:p>
     <w:p>
@@ -2372,18 +2393,11 @@
           <w:bCs/>
         </w:rPr>
       </w:pPr>
-    </w:p>
-    <w:p>
-      <w:pPr>
-        <w:rPr>
-          <w:b/>
-          <w:bCs/>
-        </w:rPr>
-      </w:pPr>
-      <w:r>
-        <w:rPr>
-          <w:b/>
-          <w:bCs/>
+      <w:r>
+        <w:rPr>
+          <w:b/>
+          <w:bCs/>
+          <w:noProof/>
         </w:rPr>
         <w:drawing>
           <wp:inline distT="0" distB="0" distL="0" distR="0" wp14:anchorId="5AB10F79" wp14:editId="55AB8D37">
@@ -2425,6 +2439,7 @@
         <w:rPr>
           <w:b/>
           <w:bCs/>
+          <w:noProof/>
         </w:rPr>
         <w:drawing>
           <wp:inline distT="0" distB="0" distL="0" distR="0" wp14:anchorId="64ED68DF" wp14:editId="02DD18FE">
@@ -2464,6 +2479,7 @@
       </w:r>
       <w:r>
         <w:rPr>
+          <w:noProof/>
           <w:lang w:val="en-US"/>
         </w:rPr>
         <w:drawing>
@@ -2505,13 +2521,75 @@
     </w:p>
     <w:p>
       <w:pPr>
+        <w:rPr>
+          <w:b/>
+          <w:bCs/>
+        </w:rPr>
+      </w:pPr>
+      <w:r>
+        <w:rPr>
+          <w:b/>
+          <w:bCs/>
+        </w:rPr>
+        <w:br w:type="page"/>
+      </w:r>
+    </w:p>
+    <w:p>
+      <w:pPr>
         <w:pStyle w:val="ListParagraph"/>
-        <w:ind w:left="1800"/>
-        <w:rPr>
-          <w:b/>
-          <w:bCs/>
-        </w:rPr>
-      </w:pPr>
+        <w:numPr>
+          <w:ilvl w:val="0"/>
+          <w:numId w:val="2"/>
+        </w:numPr>
+        <w:rPr>
+          <w:b/>
+          <w:bCs/>
+        </w:rPr>
+      </w:pPr>
+      <w:r>
+        <w:rPr>
+          <w:b/>
+          <w:bCs/>
+        </w:rPr>
+        <w:lastRenderedPageBreak/>
+        <w:t>Database Schema</w:t>
+      </w:r>
+    </w:p>
+    <w:p>
+      <w:pPr>
+        <w:rPr>
+          <w:b/>
+          <w:bCs/>
+        </w:rPr>
+      </w:pPr>
+      <w:r>
+        <w:rPr>
+          <w:b/>
+          <w:bCs/>
+        </w:rPr>
+        <w:br w:type="page"/>
+      </w:r>
+    </w:p>
+    <w:p>
+      <w:pPr>
+        <w:pStyle w:val="ListParagraph"/>
+        <w:numPr>
+          <w:ilvl w:val="0"/>
+          <w:numId w:val="2"/>
+        </w:numPr>
+        <w:rPr>
+          <w:b/>
+          <w:bCs/>
+        </w:rPr>
+      </w:pPr>
+      <w:r>
+        <w:rPr>
+          <w:b/>
+          <w:bCs/>
+        </w:rPr>
+        <w:lastRenderedPageBreak/>
+        <w:t>Script Execution Flow</w:t>
+      </w:r>
     </w:p>
     <w:p>
       <w:pPr>
@@ -2559,61 +2637,37 @@
     </w:p>
     <w:p>
       <w:pPr>
-        <w:bidi/>
-        <w:rPr>
-          <w:b/>
-          <w:bCs/>
-        </w:rPr>
-      </w:pPr>
-      <w:r>
-        <w:rPr>
-          <w:b/>
-          <w:bCs/>
-          <w:rtl/>
-        </w:rPr>
-        <w:t>ל־</w:t>
-      </w:r>
-      <w:r>
-        <w:rPr>
-          <w:b/>
-          <w:bCs/>
-        </w:rPr>
-        <w:t xml:space="preserve">ScriptHub </w:t>
-      </w:r>
-      <w:r>
-        <w:rPr>
-          <w:b/>
-          <w:bCs/>
-          <w:rtl/>
-        </w:rPr>
-        <w:t>הייתי יוצר מסמך עם הפרקים האלה</w:t>
-      </w:r>
-      <w:r>
-        <w:rPr>
-          <w:b/>
-          <w:bCs/>
-        </w:rPr>
-        <w:t>:</w:t>
-      </w:r>
-    </w:p>
-    <w:p>
-      <w:pPr>
+        <w:rPr>
+          <w:b/>
+          <w:bCs/>
+        </w:rPr>
+      </w:pPr>
+      <w:r>
+        <w:rPr>
+          <w:b/>
+          <w:bCs/>
+        </w:rPr>
+        <w:t>TODOS:</w:t>
+      </w:r>
+    </w:p>
+    <w:p>
+      <w:pPr>
+        <w:pStyle w:val="ListParagraph"/>
         <w:numPr>
           <w:ilvl w:val="0"/>
           <w:numId w:val="3"/>
         </w:numPr>
-        <w:bidi/>
-        <w:rPr>
-          <w:b/>
-          <w:bCs/>
-        </w:rPr>
-      </w:pPr>
-      <w:r>
-        <w:rPr>
-          <w:b/>
-          <w:bCs/>
-        </w:rPr>
-        <w:t xml:space="preserve">System Overview </w:t>
+        <w:rPr>
+          <w:b/>
+          <w:bCs/>
+        </w:rPr>
+      </w:pPr>
+      <w:r>
+        <w:rPr>
+          <w:b/>
+          <w:bCs/>
+        </w:rPr>
+        <w:t xml:space="preserve">Container Runtime and Isolation </w:t>
       </w:r>
     </w:p>
     <w:p>
@@ -2622,18 +2676,17 @@
           <w:ilvl w:val="0"/>
           <w:numId w:val="3"/>
         </w:numPr>
-        <w:bidi/>
-        <w:rPr>
-          <w:b/>
-          <w:bCs/>
-        </w:rPr>
-      </w:pPr>
-      <w:r>
-        <w:rPr>
-          <w:b/>
-          <w:bCs/>
-        </w:rPr>
-        <w:t xml:space="preserve">Technology Stack </w:t>
+        <w:rPr>
+          <w:b/>
+          <w:bCs/>
+        </w:rPr>
+      </w:pPr>
+      <w:r>
+        <w:rPr>
+          <w:b/>
+          <w:bCs/>
+        </w:rPr>
+        <w:t xml:space="preserve">Authentication </w:t>
       </w:r>
     </w:p>
     <w:p>
@@ -2642,18 +2695,17 @@
           <w:ilvl w:val="0"/>
           <w:numId w:val="3"/>
         </w:numPr>
-        <w:bidi/>
-        <w:rPr>
-          <w:b/>
-          <w:bCs/>
-        </w:rPr>
-      </w:pPr>
-      <w:r>
-        <w:rPr>
-          <w:b/>
-          <w:bCs/>
-        </w:rPr>
-        <w:t xml:space="preserve">High-Level Architecture </w:t>
+        <w:rPr>
+          <w:b/>
+          <w:bCs/>
+        </w:rPr>
+      </w:pPr>
+      <w:r>
+        <w:rPr>
+          <w:b/>
+          <w:bCs/>
+        </w:rPr>
+        <w:t xml:space="preserve">Error Handling </w:t>
       </w:r>
     </w:p>
     <w:p>
@@ -2662,150 +2714,10 @@
           <w:ilvl w:val="0"/>
           <w:numId w:val="3"/>
         </w:numPr>
-        <w:bidi/>
-        <w:rPr>
-          <w:b/>
-          <w:bCs/>
-        </w:rPr>
-      </w:pPr>
-      <w:r>
-        <w:rPr>
-          <w:b/>
-          <w:bCs/>
-        </w:rPr>
-        <w:t xml:space="preserve">Backend Modules and Services </w:t>
-      </w:r>
-    </w:p>
-    <w:p>
-      <w:pPr>
-        <w:numPr>
-          <w:ilvl w:val="0"/>
-          <w:numId w:val="3"/>
-        </w:numPr>
-        <w:bidi/>
-        <w:rPr>
-          <w:b/>
-          <w:bCs/>
-        </w:rPr>
-      </w:pPr>
-      <w:r>
-        <w:rPr>
-          <w:b/>
-          <w:bCs/>
-        </w:rPr>
-        <w:t xml:space="preserve">Script Execution Flow </w:t>
-      </w:r>
-    </w:p>
-    <w:p>
-      <w:pPr>
-        <w:numPr>
-          <w:ilvl w:val="0"/>
-          <w:numId w:val="3"/>
-        </w:numPr>
-        <w:bidi/>
-        <w:rPr>
-          <w:b/>
-          <w:bCs/>
-        </w:rPr>
-      </w:pPr>
-      <w:r>
-        <w:rPr>
-          <w:b/>
-          <w:bCs/>
-        </w:rPr>
-        <w:t xml:space="preserve">API Routes </w:t>
-      </w:r>
-    </w:p>
-    <w:p>
-      <w:pPr>
-        <w:numPr>
-          <w:ilvl w:val="0"/>
-          <w:numId w:val="3"/>
-        </w:numPr>
-        <w:bidi/>
-        <w:rPr>
-          <w:b/>
-          <w:bCs/>
-        </w:rPr>
-      </w:pPr>
-      <w:r>
-        <w:rPr>
-          <w:b/>
-          <w:bCs/>
-        </w:rPr>
-        <w:t xml:space="preserve">Database Schema </w:t>
-      </w:r>
-    </w:p>
-    <w:p>
-      <w:pPr>
-        <w:numPr>
-          <w:ilvl w:val="0"/>
-          <w:numId w:val="3"/>
-        </w:numPr>
-        <w:bidi/>
-        <w:rPr>
-          <w:b/>
-          <w:bCs/>
-        </w:rPr>
-      </w:pPr>
-      <w:r>
-        <w:rPr>
-          <w:b/>
-          <w:bCs/>
-        </w:rPr>
-        <w:t xml:space="preserve">Container Runtime and Isolation </w:t>
-      </w:r>
-    </w:p>
-    <w:p>
-      <w:pPr>
-        <w:numPr>
-          <w:ilvl w:val="0"/>
-          <w:numId w:val="3"/>
-        </w:numPr>
-        <w:bidi/>
-        <w:rPr>
-          <w:b/>
-          <w:bCs/>
-        </w:rPr>
-      </w:pPr>
-      <w:r>
-        <w:rPr>
-          <w:b/>
-          <w:bCs/>
-        </w:rPr>
-        <w:t xml:space="preserve">Authentication and Authorization </w:t>
-      </w:r>
-    </w:p>
-    <w:p>
-      <w:pPr>
-        <w:numPr>
-          <w:ilvl w:val="0"/>
-          <w:numId w:val="3"/>
-        </w:numPr>
-        <w:bidi/>
-        <w:rPr>
-          <w:b/>
-          <w:bCs/>
-        </w:rPr>
-      </w:pPr>
-      <w:r>
-        <w:rPr>
-          <w:b/>
-          <w:bCs/>
-        </w:rPr>
-        <w:t xml:space="preserve">Error Handling </w:t>
-      </w:r>
-    </w:p>
-    <w:p>
-      <w:pPr>
-        <w:numPr>
-          <w:ilvl w:val="0"/>
-          <w:numId w:val="3"/>
-        </w:numPr>
-        <w:bidi/>
-        <w:rPr>
-          <w:b/>
-          <w:bCs/>
+        <w:rPr>
+          <w:b/>
+          <w:bCs/>
+          <w:rtl/>
         </w:rPr>
       </w:pPr>
       <w:r>
@@ -2815,125 +2727,6 @@
         </w:rPr>
         <w:t xml:space="preserve">Deployment Architecture </w:t>
       </w:r>
-    </w:p>
-    <w:p>
-      <w:pPr>
-        <w:numPr>
-          <w:ilvl w:val="0"/>
-          <w:numId w:val="3"/>
-        </w:numPr>
-        <w:bidi/>
-        <w:rPr>
-          <w:b/>
-          <w:bCs/>
-        </w:rPr>
-      </w:pPr>
-      <w:r>
-        <w:rPr>
-          <w:b/>
-          <w:bCs/>
-        </w:rPr>
-        <w:t xml:space="preserve">Technical Decisions and Future Scaling </w:t>
-      </w:r>
-    </w:p>
-    <w:p>
-      <w:pPr>
-        <w:bidi/>
-        <w:rPr>
-          <w:b/>
-          <w:bCs/>
-        </w:rPr>
-      </w:pPr>
-      <w:r>
-        <w:rPr>
-          <w:b/>
-          <w:bCs/>
-          <w:rtl/>
-        </w:rPr>
-        <w:t xml:space="preserve">והערה חשובה: באפיון עדיף לקרוא לפרק השלישי </w:t>
-      </w:r>
-      <w:r>
-        <w:rPr>
-          <w:b/>
-          <w:bCs/>
-        </w:rPr>
-        <w:t xml:space="preserve">Components and Services, </w:t>
-      </w:r>
-      <w:r>
-        <w:rPr>
-          <w:b/>
-          <w:bCs/>
-          <w:rtl/>
-        </w:rPr>
-        <w:t xml:space="preserve">ולא ישר </w:t>
-      </w:r>
-      <w:r>
-        <w:rPr>
-          <w:b/>
-          <w:bCs/>
-        </w:rPr>
-        <w:t xml:space="preserve">Microservices, </w:t>
-      </w:r>
-      <w:r>
-        <w:rPr>
-          <w:b/>
-          <w:bCs/>
-          <w:rtl/>
-        </w:rPr>
-        <w:t>כי בשלב ה־</w:t>
-      </w:r>
-      <w:r>
-        <w:rPr>
-          <w:b/>
-          <w:bCs/>
-        </w:rPr>
-        <w:t xml:space="preserve">MVP </w:t>
-      </w:r>
-      <w:r>
-        <w:rPr>
-          <w:b/>
-          <w:bCs/>
-          <w:rtl/>
-        </w:rPr>
-        <w:t>כנראה לא כדאי להפוך כל מודול למיקרו־סרוויס. ההפרדה היחידה שבאמת מוצדקת מההתחלה היא בין ה־</w:t>
-      </w:r>
-      <w:r>
-        <w:rPr>
-          <w:b/>
-          <w:bCs/>
-        </w:rPr>
-        <w:t xml:space="preserve">API </w:t>
-      </w:r>
-      <w:r>
-        <w:rPr>
-          <w:b/>
-          <w:bCs/>
-          <w:rtl/>
-        </w:rPr>
-        <w:t>לבין ה־</w:t>
-      </w:r>
-      <w:r>
-        <w:rPr>
-          <w:b/>
-          <w:bCs/>
-        </w:rPr>
-        <w:t>Runner.</w:t>
-      </w:r>
-    </w:p>
-    <w:p>
-      <w:pPr>
-        <w:rPr>
-          <w:b/>
-          <w:bCs/>
-        </w:rPr>
-      </w:pPr>
-    </w:p>
-    <w:p>
-      <w:pPr>
-        <w:rPr>
-          <w:rtl/>
-        </w:rPr>
-      </w:pPr>
     </w:p>
     <w:sectPr>
       <w:pgSz w:w="11906" w:h="16838"/>
@@ -2948,6 +2741,92 @@
 <file path=word/numbering.xml><?xml version="1.0" encoding="utf-8"?>
 <w:numbering xmlns:wpc="http://schemas.microsoft.com/office/word/2010/wordprocessingCanvas" xmlns:cx="http://schemas.microsoft.com/office/drawing/2014/chartex" xmlns:cx1="http://schemas.microsoft.com/office/drawing/2015/9/8/chartex" xmlns:cx2="http://schemas.microsoft.com/office/drawing/2015/10/21/chartex" xmlns:cx3="http://schemas.microsoft.com/office/drawing/2016/5/9/chartex" xmlns:cx4="http://schemas.microsoft.com/office/drawing/2016/5/10/chartex" xmlns:cx5="http://schemas.microsoft.com/office/drawing/2016/5/11/chartex" xmlns:cx6="http://schemas.microsoft.com/office/drawing/2016/5/12/chartex" xmlns:cx7="http://schemas.microsoft.com/office/drawing/2016/5/13/chartex" xmlns:cx8="http://schemas.microsoft.com/office/drawing/2016/5/14/chartex" xmlns:mc="http://schemas.openxmlformats.org/markup-compatibility/2006" xmlns:aink="http://schemas.microsoft.com/office/drawing/2016/ink" xmlns:am3d="http://schemas.microsoft.com/office/drawing/2017/model3d" xmlns:o="urn:schemas-microsoft-com:office:office" xmlns:oel="http://schemas.microsoft.com/office/2019/extlst" xmlns:r="http://schemas.openxmlformats.org/officeDocument/2006/relationships" xmlns:m="http://schemas.openxmlformats.org/officeDocument/2006/math" xmlns:v="urn:schemas-microsoft-com:vml" xmlns:wp14="http://schemas.microsoft.com/office/word/2010/wordprocessingDrawing" xmlns:wp="http://schemas.openxmlformats.org/drawingml/2006/wordprocessingDrawing" xmlns:w10="urn:schemas-microsoft-com:office:word" xmlns:w="http://schemas.openxmlformats.org/wordprocessingml/2006/main" xmlns:w14="http://schemas.microsoft.com/office/word/2010/wordml" xmlns:w15="http://schemas.microsoft.com/office/word/2012/wordml" xmlns:w16cei="http://schemas.microsoft.com/office/word/2026/wordml/cei" xmlns:w16cex="http://schemas.microsoft.com/office/word/2018/wordml/cex" xmlns:w16cid="http://schemas.microsoft.com/office/word/2016/wordml/cid" xmlns:w16="http://schemas.microsoft.com/office/word/2018/wordml" xmlns:w16du="http://schemas.microsoft.com/office/word/2023/wordml/word16du" xmlns:w16sdtdh="http://schemas.microsoft.com/office/word/2020/wordml/sdtdatahash" xmlns:w16sdtfl="http://schemas.microsoft.com/office/word/2024/wordml/sdtformatlock" xmlns:w16se="http://schemas.microsoft.com/office/word/2015/wordml/symex" xmlns:wpg="http://schemas.microsoft.com/office/word/2010/wordprocessingGroup" xmlns:wpi="http://schemas.microsoft.com/office/word/2010/wordprocessingInk" xmlns:wne="http://schemas.microsoft.com/office/word/2006/wordml" xmlns:wps="http://schemas.microsoft.com/office/word/2010/wordprocessingShape" mc:Ignorable="w14 w15 w16se w16cid w16 w16cex w16sdtdh w16sdtfl w16du wp14">
   <w:abstractNum w:abstractNumId="0" w15:restartNumberingAfterBreak="0">
+    <w:nsid w:val="0D215F5C"/>
+    <w:multiLevelType w:val="hybridMultilevel"/>
+    <w:tmpl w:val="207CAE6A"/>
+    <w:lvl w:ilvl="0" w:tplc="2000000F">
+      <w:start w:val="1"/>
+      <w:numFmt w:val="decimal"/>
+      <w:lvlText w:val="%1."/>
+      <w:lvlJc w:val="left"/>
+      <w:pPr>
+        <w:ind w:left="360" w:hanging="360"/>
+      </w:pPr>
+    </w:lvl>
+    <w:lvl w:ilvl="1" w:tplc="20000019" w:tentative="1">
+      <w:start w:val="1"/>
+      <w:numFmt w:val="lowerLetter"/>
+      <w:lvlText w:val="%2."/>
+      <w:lvlJc w:val="left"/>
+      <w:pPr>
+        <w:ind w:left="1080" w:hanging="360"/>
+      </w:pPr>
+    </w:lvl>
+    <w:lvl w:ilvl="2" w:tplc="2000001B" w:tentative="1">
+      <w:start w:val="1"/>
+      <w:numFmt w:val="lowerRoman"/>
+      <w:lvlText w:val="%3."/>
+      <w:lvlJc w:val="right"/>
+      <w:pPr>
+        <w:ind w:left="1800" w:hanging="180"/>
+      </w:pPr>
+    </w:lvl>
+    <w:lvl w:ilvl="3" w:tplc="2000000F" w:tentative="1">
+      <w:start w:val="1"/>
+      <w:numFmt w:val="decimal"/>
+      <w:lvlText w:val="%4."/>
+      <w:lvlJc w:val="left"/>
+      <w:pPr>
+        <w:ind w:left="2520" w:hanging="360"/>
+      </w:pPr>
+    </w:lvl>
+    <w:lvl w:ilvl="4" w:tplc="20000019" w:tentative="1">
+      <w:start w:val="1"/>
+      <w:numFmt w:val="lowerLetter"/>
+      <w:lvlText w:val="%5."/>
+      <w:lvlJc w:val="left"/>
+      <w:pPr>
+        <w:ind w:left="3240" w:hanging="360"/>
+      </w:pPr>
+    </w:lvl>
+    <w:lvl w:ilvl="5" w:tplc="2000001B" w:tentative="1">
+      <w:start w:val="1"/>
+      <w:numFmt w:val="lowerRoman"/>
+      <w:lvlText w:val="%6."/>
+      <w:lvlJc w:val="right"/>
+      <w:pPr>
+        <w:ind w:left="3960" w:hanging="180"/>
+      </w:pPr>
+    </w:lvl>
+    <w:lvl w:ilvl="6" w:tplc="2000000F" w:tentative="1">
+      <w:start w:val="1"/>
+      <w:numFmt w:val="decimal"/>
+      <w:lvlText w:val="%7."/>
+      <w:lvlJc w:val="left"/>
+      <w:pPr>
+        <w:ind w:left="4680" w:hanging="360"/>
+      </w:pPr>
+    </w:lvl>
+    <w:lvl w:ilvl="7" w:tplc="20000019" w:tentative="1">
+      <w:start w:val="1"/>
+      <w:numFmt w:val="lowerLetter"/>
+      <w:lvlText w:val="%8."/>
+      <w:lvlJc w:val="left"/>
+      <w:pPr>
+        <w:ind w:left="5400" w:hanging="360"/>
+      </w:pPr>
+    </w:lvl>
+    <w:lvl w:ilvl="8" w:tplc="2000001B" w:tentative="1">
+      <w:start w:val="1"/>
+      <w:numFmt w:val="lowerRoman"/>
+      <w:lvlText w:val="%9."/>
+      <w:lvlJc w:val="right"/>
+      <w:pPr>
+        <w:ind w:left="6120" w:hanging="180"/>
+      </w:pPr>
+    </w:lvl>
+  </w:abstractNum>
+  <w:abstractNum w:abstractNumId="1" w15:restartNumberingAfterBreak="0">
     <w:nsid w:val="2D066B6F"/>
     <w:multiLevelType w:val="hybridMultilevel"/>
     <w:tmpl w:val="5A4A3B1E"/>
@@ -3036,7 +2915,7 @@
       </w:pPr>
     </w:lvl>
   </w:abstractNum>
-  <w:abstractNum w:abstractNumId="1" w15:restartNumberingAfterBreak="0">
+  <w:abstractNum w:abstractNumId="2" w15:restartNumberingAfterBreak="0">
     <w:nsid w:val="35692CE8"/>
     <w:multiLevelType w:val="hybridMultilevel"/>
     <w:tmpl w:val="842E7E0E"/>
@@ -3125,7 +3004,7 @@
       </w:pPr>
     </w:lvl>
   </w:abstractNum>
-  <w:abstractNum w:abstractNumId="2" w15:restartNumberingAfterBreak="0">
+  <w:abstractNum w:abstractNumId="3" w15:restartNumberingAfterBreak="0">
     <w:nsid w:val="5BDD72A0"/>
     <w:multiLevelType w:val="multilevel"/>
     <w:tmpl w:val="75141B60"/>
@@ -3239,13 +3118,16 @@
     </w:lvl>
   </w:abstractNum>
   <w:num w:numId="1" w16cid:durableId="397410995">
+    <w:abstractNumId w:val="2"/>
+  </w:num>
+  <w:num w:numId="2" w16cid:durableId="1278953679">
     <w:abstractNumId w:val="1"/>
   </w:num>
-  <w:num w:numId="2" w16cid:durableId="1278953679">
+  <w:num w:numId="3" w16cid:durableId="1525629689">
+    <w:abstractNumId w:val="3"/>
+  </w:num>
+  <w:num w:numId="4" w16cid:durableId="1178420585">
     <w:abstractNumId w:val="0"/>
-  </w:num>
-  <w:num w:numId="3" w16cid:durableId="1525629689">
-    <w:abstractNumId w:val="2"/>
   </w:num>
 </w:numbering>
 </file>

</xml_diff>

<commit_message>
Add config item dependencies across app
Introduces ConfigItem and ScriptConfigItemDependency in Prisma, adds nullable Script.resultType, and wires a new NestJS config-items module with CRUD endpoints plus script queries that include imported config dependencies. Updates shared request/types naming and frontend integration by fetching scripts via React Query/Axios, then adds code/info dialogs (Monaco + metadata view) and run/script UI updates to use the new API-backed types.
</commit_message>
<xml_diff>
--- a/Specifications/TDD.docx
+++ b/Specifications/TDD.docx
@@ -2352,6 +2352,154 @@
     </w:p>
     <w:p>
       <w:pPr>
+        <w:pStyle w:val="ListParagraph"/>
+        <w:numPr>
+          <w:ilvl w:val="0"/>
+          <w:numId w:val="5"/>
+        </w:numPr>
+        <w:rPr>
+          <w:b/>
+          <w:bCs/>
+        </w:rPr>
+      </w:pPr>
+      <w:r>
+        <w:rPr>
+          <w:b/>
+          <w:bCs/>
+        </w:rPr>
+        <w:t xml:space="preserve">The request body in post and put requests is </w:t>
+      </w:r>
+      <w:proofErr w:type="gramStart"/>
+      <w:r>
+        <w:rPr>
+          <w:b/>
+          <w:bCs/>
+        </w:rPr>
+        <w:t>similar to</w:t>
+      </w:r>
+      <w:proofErr w:type="gramEnd"/>
+      <w:r>
+        <w:rPr>
+          <w:b/>
+          <w:bCs/>
+        </w:rPr>
+        <w:t xml:space="preserve"> the API Models examples, without id, </w:t>
+      </w:r>
+      <w:proofErr w:type="spellStart"/>
+      <w:r>
+        <w:rPr>
+          <w:b/>
+          <w:bCs/>
+        </w:rPr>
+        <w:t>createdAt</w:t>
+      </w:r>
+      <w:proofErr w:type="spellEnd"/>
+      <w:r>
+        <w:rPr>
+          <w:b/>
+          <w:bCs/>
+        </w:rPr>
+        <w:t xml:space="preserve"> and </w:t>
+      </w:r>
+      <w:proofErr w:type="spellStart"/>
+      <w:r>
+        <w:rPr>
+          <w:b/>
+          <w:bCs/>
+        </w:rPr>
+        <w:t>updatedAt</w:t>
+      </w:r>
+      <w:proofErr w:type="spellEnd"/>
+      <w:r>
+        <w:rPr>
+          <w:b/>
+          <w:bCs/>
+        </w:rPr>
+        <w:t xml:space="preserve"> fields.</w:t>
+      </w:r>
+    </w:p>
+    <w:p>
+      <w:pPr>
+        <w:pStyle w:val="ListParagraph"/>
+        <w:numPr>
+          <w:ilvl w:val="0"/>
+          <w:numId w:val="5"/>
+        </w:numPr>
+        <w:rPr>
+          <w:b/>
+          <w:bCs/>
+        </w:rPr>
+      </w:pPr>
+      <w:r>
+        <w:rPr>
+          <w:b/>
+          <w:bCs/>
+        </w:rPr>
+        <w:t>PUT and GET return status code 200</w:t>
+      </w:r>
+    </w:p>
+    <w:p>
+      <w:pPr>
+        <w:pStyle w:val="ListParagraph"/>
+        <w:numPr>
+          <w:ilvl w:val="0"/>
+          <w:numId w:val="5"/>
+        </w:numPr>
+        <w:rPr>
+          <w:b/>
+          <w:bCs/>
+        </w:rPr>
+      </w:pPr>
+      <w:r>
+        <w:rPr>
+          <w:b/>
+          <w:bCs/>
+        </w:rPr>
+        <w:t>POST returns status code 201</w:t>
+      </w:r>
+    </w:p>
+    <w:p>
+      <w:pPr>
+        <w:pStyle w:val="ListParagraph"/>
+        <w:numPr>
+          <w:ilvl w:val="0"/>
+          <w:numId w:val="5"/>
+        </w:numPr>
+        <w:rPr>
+          <w:b/>
+          <w:bCs/>
+        </w:rPr>
+      </w:pPr>
+      <w:r>
+        <w:rPr>
+          <w:b/>
+          <w:bCs/>
+        </w:rPr>
+        <w:t>DELETE returns 200 and the deleted object</w:t>
+      </w:r>
+    </w:p>
+    <w:p>
+      <w:pPr>
+        <w:pStyle w:val="ListParagraph"/>
+        <w:numPr>
+          <w:ilvl w:val="0"/>
+          <w:numId w:val="5"/>
+        </w:numPr>
+        <w:rPr>
+          <w:b/>
+          <w:bCs/>
+        </w:rPr>
+      </w:pPr>
+      <w:r>
+        <w:rPr>
+          <w:b/>
+          <w:bCs/>
+        </w:rPr>
+        <w:t>Common error status codes will be 500, 400, 404, 403, 401</w:t>
+      </w:r>
+    </w:p>
+    <w:p>
+      <w:pPr>
         <w:rPr>
           <w:b/>
           <w:bCs/>
@@ -2437,6 +2585,47 @@
       </w:r>
       <w:r>
         <w:rPr>
+          <w:noProof/>
+          <w:lang w:val="en-US"/>
+        </w:rPr>
+        <w:drawing>
+          <wp:inline distT="0" distB="0" distL="0" distR="0" wp14:anchorId="435BB527" wp14:editId="304168F8">
+            <wp:extent cx="2105319" cy="2534004"/>
+            <wp:effectExtent l="0" t="0" r="9525" b="0"/>
+            <wp:docPr id="1847569525" name="Picture 1"/>
+            <wp:cNvGraphicFramePr>
+              <a:graphicFrameLocks xmlns:a="http://schemas.openxmlformats.org/drawingml/2006/main" noChangeAspect="1"/>
+            </wp:cNvGraphicFramePr>
+            <a:graphic xmlns:a="http://schemas.openxmlformats.org/drawingml/2006/main">
+              <a:graphicData uri="http://schemas.openxmlformats.org/drawingml/2006/picture">
+                <pic:pic xmlns:pic="http://schemas.openxmlformats.org/drawingml/2006/picture">
+                  <pic:nvPicPr>
+                    <pic:cNvPr id="1847569525" name=""/>
+                    <pic:cNvPicPr/>
+                  </pic:nvPicPr>
+                  <pic:blipFill>
+                    <a:blip r:embed="rId6"/>
+                    <a:stretch>
+                      <a:fillRect/>
+                    </a:stretch>
+                  </pic:blipFill>
+                  <pic:spPr>
+                    <a:xfrm>
+                      <a:off x="0" y="0"/>
+                      <a:ext cx="2105319" cy="2534004"/>
+                    </a:xfrm>
+                    <a:prstGeom prst="rect">
+                      <a:avLst/>
+                    </a:prstGeom>
+                  </pic:spPr>
+                </pic:pic>
+              </a:graphicData>
+            </a:graphic>
+          </wp:inline>
+        </w:drawing>
+      </w:r>
+      <w:r>
+        <w:rPr>
           <w:b/>
           <w:bCs/>
           <w:noProof/>
@@ -2457,7 +2646,7 @@
                     <pic:cNvPicPr/>
                   </pic:nvPicPr>
                   <pic:blipFill>
-                    <a:blip r:embed="rId6"/>
+                    <a:blip r:embed="rId7"/>
                     <a:stretch>
                       <a:fillRect/>
                     </a:stretch>
@@ -2483,10 +2672,10 @@
           <w:lang w:val="en-US"/>
         </w:rPr>
         <w:drawing>
-          <wp:inline distT="0" distB="0" distL="0" distR="0" wp14:anchorId="3C7E3C03" wp14:editId="51D102C0">
-            <wp:extent cx="2105319" cy="2534004"/>
-            <wp:effectExtent l="0" t="0" r="9525" b="0"/>
-            <wp:docPr id="1847569525" name="Picture 1"/>
+          <wp:inline distT="0" distB="0" distL="0" distR="0" wp14:anchorId="6250D027" wp14:editId="514E6346">
+            <wp:extent cx="2486372" cy="1762371"/>
+            <wp:effectExtent l="0" t="0" r="9525" b="9525"/>
+            <wp:docPr id="1989589624" name="Picture 1"/>
             <wp:cNvGraphicFramePr>
               <a:graphicFrameLocks xmlns:a="http://schemas.openxmlformats.org/drawingml/2006/main" noChangeAspect="1"/>
             </wp:cNvGraphicFramePr>
@@ -2494,11 +2683,11 @@
               <a:graphicData uri="http://schemas.openxmlformats.org/drawingml/2006/picture">
                 <pic:pic xmlns:pic="http://schemas.openxmlformats.org/drawingml/2006/picture">
                   <pic:nvPicPr>
-                    <pic:cNvPr id="1847569525" name=""/>
+                    <pic:cNvPr id="1989589624" name=""/>
                     <pic:cNvPicPr/>
                   </pic:nvPicPr>
                   <pic:blipFill>
-                    <a:blip r:embed="rId7"/>
+                    <a:blip r:embed="rId8"/>
                     <a:stretch>
                       <a:fillRect/>
                     </a:stretch>
@@ -2506,7 +2695,7 @@
                   <pic:spPr>
                     <a:xfrm>
                       <a:off x="0" y="0"/>
-                      <a:ext cx="2105319" cy="2534004"/>
+                      <a:ext cx="2486372" cy="1762371"/>
                     </a:xfrm>
                     <a:prstGeom prst="rect">
                       <a:avLst/>
@@ -2562,6 +2751,59 @@
           <w:bCs/>
         </w:rPr>
       </w:pPr>
+      <w:r>
+        <w:rPr>
+          <w:noProof/>
+        </w:rPr>
+        <w:drawing>
+          <wp:inline distT="0" distB="0" distL="0" distR="0" wp14:anchorId="5276D7E2" wp14:editId="5C0B2ABD">
+            <wp:extent cx="3867150" cy="7625080"/>
+            <wp:effectExtent l="0" t="0" r="0" b="0"/>
+            <wp:docPr id="1476705946" name="Picture 19"/>
+            <wp:cNvGraphicFramePr>
+              <a:graphicFrameLocks xmlns:a="http://schemas.openxmlformats.org/drawingml/2006/main" noChangeAspect="1"/>
+            </wp:cNvGraphicFramePr>
+            <a:graphic xmlns:a="http://schemas.openxmlformats.org/drawingml/2006/main">
+              <a:graphicData uri="http://schemas.openxmlformats.org/drawingml/2006/picture">
+                <pic:pic xmlns:pic="http://schemas.openxmlformats.org/drawingml/2006/picture">
+                  <pic:nvPicPr>
+                    <pic:cNvPr id="0" name="Picture 1"/>
+                    <pic:cNvPicPr>
+                      <a:picLocks noChangeAspect="1" noChangeArrowheads="1"/>
+                    </pic:cNvPicPr>
+                  </pic:nvPicPr>
+                  <pic:blipFill>
+                    <a:blip r:embed="rId9" cstate="print">
+                      <a:extLst>
+                        <a:ext uri="{28A0092B-C50C-407E-A947-70E740481C1C}">
+                          <a14:useLocalDpi xmlns:a14="http://schemas.microsoft.com/office/drawing/2010/main" val="0"/>
+                        </a:ext>
+                      </a:extLst>
+                    </a:blip>
+                    <a:srcRect/>
+                    <a:stretch>
+                      <a:fillRect/>
+                    </a:stretch>
+                  </pic:blipFill>
+                  <pic:spPr bwMode="auto">
+                    <a:xfrm>
+                      <a:off x="0" y="0"/>
+                      <a:ext cx="3867150" cy="7625080"/>
+                    </a:xfrm>
+                    <a:prstGeom prst="rect">
+                      <a:avLst/>
+                    </a:prstGeom>
+                    <a:noFill/>
+                    <a:ln>
+                      <a:noFill/>
+                    </a:ln>
+                  </pic:spPr>
+                </pic:pic>
+              </a:graphicData>
+            </a:graphic>
+          </wp:inline>
+        </w:drawing>
+      </w:r>
       <w:r>
         <w:rPr>
           <w:b/>
@@ -3005,6 +3247,118 @@
     </w:lvl>
   </w:abstractNum>
   <w:abstractNum w:abstractNumId="3" w15:restartNumberingAfterBreak="0">
+    <w:nsid w:val="4D2E2EF4"/>
+    <w:multiLevelType w:val="hybridMultilevel"/>
+    <w:tmpl w:val="ADE010E8"/>
+    <w:lvl w:ilvl="0" w:tplc="617AFA36">
+      <w:numFmt w:val="bullet"/>
+      <w:lvlText w:val=""/>
+      <w:lvlJc w:val="left"/>
+      <w:pPr>
+        <w:ind w:left="720" w:hanging="360"/>
+      </w:pPr>
+      <w:rPr>
+        <w:rFonts w:ascii="Symbol" w:eastAsiaTheme="minorHAnsi" w:hAnsi="Symbol" w:cstheme="minorBidi" w:hint="default"/>
+      </w:rPr>
+    </w:lvl>
+    <w:lvl w:ilvl="1" w:tplc="20000003" w:tentative="1">
+      <w:start w:val="1"/>
+      <w:numFmt w:val="bullet"/>
+      <w:lvlText w:val="o"/>
+      <w:lvlJc w:val="left"/>
+      <w:pPr>
+        <w:ind w:left="1440" w:hanging="360"/>
+      </w:pPr>
+      <w:rPr>
+        <w:rFonts w:ascii="Courier New" w:hAnsi="Courier New" w:cs="Courier New" w:hint="default"/>
+      </w:rPr>
+    </w:lvl>
+    <w:lvl w:ilvl="2" w:tplc="20000005" w:tentative="1">
+      <w:start w:val="1"/>
+      <w:numFmt w:val="bullet"/>
+      <w:lvlText w:val=""/>
+      <w:lvlJc w:val="left"/>
+      <w:pPr>
+        <w:ind w:left="2160" w:hanging="360"/>
+      </w:pPr>
+      <w:rPr>
+        <w:rFonts w:ascii="Wingdings" w:hAnsi="Wingdings" w:hint="default"/>
+      </w:rPr>
+    </w:lvl>
+    <w:lvl w:ilvl="3" w:tplc="20000001" w:tentative="1">
+      <w:start w:val="1"/>
+      <w:numFmt w:val="bullet"/>
+      <w:lvlText w:val=""/>
+      <w:lvlJc w:val="left"/>
+      <w:pPr>
+        <w:ind w:left="2880" w:hanging="360"/>
+      </w:pPr>
+      <w:rPr>
+        <w:rFonts w:ascii="Symbol" w:hAnsi="Symbol" w:hint="default"/>
+      </w:rPr>
+    </w:lvl>
+    <w:lvl w:ilvl="4" w:tplc="20000003" w:tentative="1">
+      <w:start w:val="1"/>
+      <w:numFmt w:val="bullet"/>
+      <w:lvlText w:val="o"/>
+      <w:lvlJc w:val="left"/>
+      <w:pPr>
+        <w:ind w:left="3600" w:hanging="360"/>
+      </w:pPr>
+      <w:rPr>
+        <w:rFonts w:ascii="Courier New" w:hAnsi="Courier New" w:cs="Courier New" w:hint="default"/>
+      </w:rPr>
+    </w:lvl>
+    <w:lvl w:ilvl="5" w:tplc="20000005" w:tentative="1">
+      <w:start w:val="1"/>
+      <w:numFmt w:val="bullet"/>
+      <w:lvlText w:val=""/>
+      <w:lvlJc w:val="left"/>
+      <w:pPr>
+        <w:ind w:left="4320" w:hanging="360"/>
+      </w:pPr>
+      <w:rPr>
+        <w:rFonts w:ascii="Wingdings" w:hAnsi="Wingdings" w:hint="default"/>
+      </w:rPr>
+    </w:lvl>
+    <w:lvl w:ilvl="6" w:tplc="20000001" w:tentative="1">
+      <w:start w:val="1"/>
+      <w:numFmt w:val="bullet"/>
+      <w:lvlText w:val=""/>
+      <w:lvlJc w:val="left"/>
+      <w:pPr>
+        <w:ind w:left="5040" w:hanging="360"/>
+      </w:pPr>
+      <w:rPr>
+        <w:rFonts w:ascii="Symbol" w:hAnsi="Symbol" w:hint="default"/>
+      </w:rPr>
+    </w:lvl>
+    <w:lvl w:ilvl="7" w:tplc="20000003" w:tentative="1">
+      <w:start w:val="1"/>
+      <w:numFmt w:val="bullet"/>
+      <w:lvlText w:val="o"/>
+      <w:lvlJc w:val="left"/>
+      <w:pPr>
+        <w:ind w:left="5760" w:hanging="360"/>
+      </w:pPr>
+      <w:rPr>
+        <w:rFonts w:ascii="Courier New" w:hAnsi="Courier New" w:cs="Courier New" w:hint="default"/>
+      </w:rPr>
+    </w:lvl>
+    <w:lvl w:ilvl="8" w:tplc="20000005" w:tentative="1">
+      <w:start w:val="1"/>
+      <w:numFmt w:val="bullet"/>
+      <w:lvlText w:val=""/>
+      <w:lvlJc w:val="left"/>
+      <w:pPr>
+        <w:ind w:left="6480" w:hanging="360"/>
+      </w:pPr>
+      <w:rPr>
+        <w:rFonts w:ascii="Wingdings" w:hAnsi="Wingdings" w:hint="default"/>
+      </w:rPr>
+    </w:lvl>
+  </w:abstractNum>
+  <w:abstractNum w:abstractNumId="4" w15:restartNumberingAfterBreak="0">
     <w:nsid w:val="5BDD72A0"/>
     <w:multiLevelType w:val="multilevel"/>
     <w:tmpl w:val="75141B60"/>
@@ -3124,10 +3478,13 @@
     <w:abstractNumId w:val="1"/>
   </w:num>
   <w:num w:numId="3" w16cid:durableId="1525629689">
-    <w:abstractNumId w:val="3"/>
+    <w:abstractNumId w:val="4"/>
   </w:num>
   <w:num w:numId="4" w16cid:durableId="1178420585">
     <w:abstractNumId w:val="0"/>
+  </w:num>
+  <w:num w:numId="5" w16cid:durableId="1295914763">
+    <w:abstractNumId w:val="3"/>
   </w:num>
 </w:numbering>
 </file>

</xml_diff>